<commit_message>
Atualiza modelos e documentos REA
</commit_message>
<xml_diff>
--- a/modelos/admissao-funcionario.docx
+++ b/modelos/admissao-funcionario.docx
@@ -9,7 +9,6 @@
         <w:keepLines w:val="false"/>
         <w:pageBreakBefore w:val="false"/>
         <w:widowControl w:val="false"/>
-        <w:pBdr/>
         <w:shd w:val="clear" w:fill="auto"/>
         <w:spacing w:lineRule="auto" w:line="240" w:before="0" w:after="0"/>
         <w:ind w:hanging="0" w:start="0" w:end="659"/>
@@ -62,7 +61,6 @@
         <w:keepLines w:val="false"/>
         <w:pageBreakBefore w:val="false"/>
         <w:widowControl w:val="false"/>
-        <w:pBdr/>
         <w:shd w:val="clear" w:fill="auto"/>
         <w:spacing w:lineRule="auto" w:line="240" w:before="892" w:after="0"/>
         <w:ind w:hanging="0" w:start="107" w:end="0"/>
@@ -119,7 +117,6 @@
         <w:keepLines w:val="false"/>
         <w:pageBreakBefore w:val="false"/>
         <w:widowControl w:val="false"/>
-        <w:pBdr/>
         <w:shd w:val="clear" w:fill="auto"/>
         <w:spacing w:lineRule="auto" w:line="240" w:before="200" w:after="0"/>
         <w:ind w:hanging="0" w:start="96" w:end="0"/>
@@ -176,7 +173,6 @@
         <w:keepLines w:val="false"/>
         <w:pageBreakBefore w:val="false"/>
         <w:widowControl w:val="false"/>
-        <w:pBdr/>
         <w:shd w:val="clear" w:fill="auto"/>
         <w:spacing w:lineRule="auto" w:line="240" w:before="180" w:after="0"/>
         <w:ind w:hanging="0" w:start="107" w:end="0"/>
@@ -233,7 +229,6 @@
         <w:keepLines w:val="false"/>
         <w:pageBreakBefore w:val="false"/>
         <w:widowControl w:val="false"/>
-        <w:pBdr/>
         <w:shd w:val="clear" w:fill="auto"/>
         <w:spacing w:lineRule="auto" w:line="240" w:before="185" w:after="0"/>
         <w:ind w:hanging="0" w:start="45" w:end="0"/>
@@ -290,7 +285,6 @@
         <w:keepLines w:val="false"/>
         <w:pageBreakBefore w:val="false"/>
         <w:widowControl w:val="false"/>
-        <w:pBdr/>
         <w:shd w:val="clear" w:fill="auto"/>
         <w:spacing w:lineRule="auto" w:line="240" w:before="370" w:after="0"/>
         <w:ind w:hanging="0" w:start="0" w:end="0"/>
@@ -343,7 +337,6 @@
         <w:keepLines w:val="false"/>
         <w:pageBreakBefore w:val="false"/>
         <w:widowControl w:val="false"/>
-        <w:pBdr/>
         <w:shd w:val="clear" w:fill="auto"/>
         <w:spacing w:lineRule="auto" w:line="240" w:before="351" w:after="0"/>
         <w:ind w:hanging="0" w:start="43" w:end="0"/>
@@ -400,7 +393,6 @@
         <w:keepLines w:val="false"/>
         <w:pageBreakBefore w:val="false"/>
         <w:widowControl w:val="false"/>
-        <w:pBdr/>
         <w:shd w:val="clear" w:fill="auto"/>
         <w:spacing w:lineRule="auto" w:line="240" w:before="200" w:after="0"/>
         <w:ind w:hanging="0" w:start="43" w:end="0"/>
@@ -457,15 +449,14 @@
         <w:keepLines w:val="false"/>
         <w:pageBreakBefore w:val="false"/>
         <w:widowControl w:val="false"/>
-        <w:pBdr/>
         <w:shd w:val="clear" w:fill="auto"/>
         <w:spacing w:lineRule="auto" w:line="240" w:before="200" w:after="0"/>
         <w:ind w:hanging="0" w:start="43" w:end="0"/>
         <w:jc w:val="start"/>
         <w:rPr>
           <w:rFonts w:ascii="Open Sans" w:hAnsi="Open Sans" w:eastAsia="Open Sans" w:cs="Open Sans"/>
-          <w:b/>
-          <w:bCs/>
+          <w:b w:val="false"/>
+          <w:bCs w:val="false"/>
           <w:i w:val="false"/>
           <w:iCs w:val="false"/>
           <w:caps w:val="false"/>
@@ -503,15 +494,493 @@
         <w:t xml:space="preserve">Nome do funcionário contratado: </w:t>
       </w:r>
       <w:r>
-        <w:rPr/>
-        <w:t>[[CARGO]]</w:t>
-      </w:r>
-    </w:p>
-    <w:p>
-      <w:pPr>
-        <w:pStyle w:val="normal1"/>
-        <w:widowControl w:val="false"/>
-        <w:pBdr/>
+        <w:rPr>
+          <w:rFonts w:eastAsia="Open Sans" w:cs="Open Sans" w:ascii="Open Sans" w:hAnsi="Open Sans"/>
+          <w:b w:val="false"/>
+          <w:bCs w:val="false"/>
+          <w:i w:val="false"/>
+          <w:iCs w:val="false"/>
+          <w:caps w:val="false"/>
+          <w:smallCaps w:val="false"/>
+          <w:strike w:val="false"/>
+          <w:dstrike w:val="false"/>
+          <w:color w:val="000000"/>
+          <w:position w:val="0"/>
+          <w:sz w:val="22"/>
+          <w:szCs w:val="22"/>
+          <w:u w:val="none"/>
+          <w:shd w:fill="auto" w:val="clear"/>
+          <w:vertAlign w:val="baseline"/>
+        </w:rPr>
+        <w:t>[</w:t>
+      </w:r>
+      <w:r>
+        <w:rPr>
+          <w:rFonts w:eastAsia="Open Sans" w:cs="Open Sans" w:ascii="Open Sans" w:hAnsi="Open Sans"/>
+          <w:b w:val="false"/>
+          <w:bCs w:val="false"/>
+          <w:i w:val="false"/>
+          <w:iCs w:val="false"/>
+          <w:caps w:val="false"/>
+          <w:smallCaps w:val="false"/>
+          <w:strike w:val="false"/>
+          <w:dstrike w:val="false"/>
+          <w:color w:val="000000"/>
+          <w:position w:val="0"/>
+          <w:sz w:val="22"/>
+          <w:szCs w:val="22"/>
+          <w:u w:val="none"/>
+          <w:shd w:fill="auto" w:val="clear"/>
+          <w:vertAlign w:val="baseline"/>
+        </w:rPr>
+        <w:t>[</w:t>
+      </w:r>
+      <w:r>
+        <w:rPr>
+          <w:rFonts w:eastAsia="Open Sans" w:cs="Open Sans" w:ascii="Open Sans" w:hAnsi="Open Sans"/>
+          <w:b w:val="false"/>
+          <w:bCs w:val="false"/>
+          <w:i w:val="false"/>
+          <w:iCs w:val="false"/>
+          <w:caps w:val="false"/>
+          <w:smallCaps w:val="false"/>
+          <w:strike w:val="false"/>
+          <w:dstrike w:val="false"/>
+          <w:color w:val="000000"/>
+          <w:position w:val="0"/>
+          <w:sz w:val="22"/>
+          <w:szCs w:val="22"/>
+          <w:u w:val="none"/>
+          <w:shd w:fill="auto" w:val="clear"/>
+          <w:vertAlign w:val="baseline"/>
+        </w:rPr>
+        <w:t>F</w:t>
+      </w:r>
+      <w:r>
+        <w:rPr>
+          <w:rFonts w:eastAsia="Open Sans" w:cs="Open Sans" w:ascii="Open Sans" w:hAnsi="Open Sans"/>
+          <w:b w:val="false"/>
+          <w:bCs w:val="false"/>
+          <w:i w:val="false"/>
+          <w:iCs w:val="false"/>
+          <w:caps w:val="false"/>
+          <w:smallCaps w:val="false"/>
+          <w:strike w:val="false"/>
+          <w:dstrike w:val="false"/>
+          <w:color w:val="000000"/>
+          <w:position w:val="0"/>
+          <w:sz w:val="22"/>
+          <w:szCs w:val="22"/>
+          <w:u w:val="none"/>
+          <w:shd w:fill="auto" w:val="clear"/>
+          <w:vertAlign w:val="baseline"/>
+        </w:rPr>
+        <w:t>U</w:t>
+      </w:r>
+      <w:r>
+        <w:rPr>
+          <w:rFonts w:eastAsia="Open Sans" w:cs="Open Sans" w:ascii="Open Sans" w:hAnsi="Open Sans"/>
+          <w:b w:val="false"/>
+          <w:bCs w:val="false"/>
+          <w:i w:val="false"/>
+          <w:iCs w:val="false"/>
+          <w:caps w:val="false"/>
+          <w:smallCaps w:val="false"/>
+          <w:strike w:val="false"/>
+          <w:dstrike w:val="false"/>
+          <w:color w:val="000000"/>
+          <w:position w:val="0"/>
+          <w:sz w:val="22"/>
+          <w:szCs w:val="22"/>
+          <w:u w:val="none"/>
+          <w:shd w:fill="auto" w:val="clear"/>
+          <w:vertAlign w:val="baseline"/>
+        </w:rPr>
+        <w:t>N</w:t>
+      </w:r>
+      <w:r>
+        <w:rPr>
+          <w:rFonts w:eastAsia="Open Sans" w:cs="Open Sans" w:ascii="Open Sans" w:hAnsi="Open Sans"/>
+          <w:b w:val="false"/>
+          <w:bCs w:val="false"/>
+          <w:i w:val="false"/>
+          <w:iCs w:val="false"/>
+          <w:caps w:val="false"/>
+          <w:smallCaps w:val="false"/>
+          <w:strike w:val="false"/>
+          <w:dstrike w:val="false"/>
+          <w:color w:val="000000"/>
+          <w:position w:val="0"/>
+          <w:sz w:val="22"/>
+          <w:szCs w:val="22"/>
+          <w:u w:val="none"/>
+          <w:shd w:fill="auto" w:val="clear"/>
+          <w:vertAlign w:val="baseline"/>
+        </w:rPr>
+        <w:t>C</w:t>
+      </w:r>
+      <w:r>
+        <w:rPr>
+          <w:rFonts w:eastAsia="Open Sans" w:cs="Open Sans" w:ascii="Open Sans" w:hAnsi="Open Sans"/>
+          <w:b w:val="false"/>
+          <w:bCs w:val="false"/>
+          <w:i w:val="false"/>
+          <w:iCs w:val="false"/>
+          <w:caps w:val="false"/>
+          <w:smallCaps w:val="false"/>
+          <w:strike w:val="false"/>
+          <w:dstrike w:val="false"/>
+          <w:color w:val="000000"/>
+          <w:position w:val="0"/>
+          <w:sz w:val="22"/>
+          <w:szCs w:val="22"/>
+          <w:u w:val="none"/>
+          <w:shd w:fill="auto" w:val="clear"/>
+          <w:vertAlign w:val="baseline"/>
+        </w:rPr>
+        <w:t>I</w:t>
+      </w:r>
+      <w:r>
+        <w:rPr>
+          <w:rFonts w:eastAsia="Open Sans" w:cs="Open Sans" w:ascii="Open Sans" w:hAnsi="Open Sans"/>
+          <w:b w:val="false"/>
+          <w:bCs w:val="false"/>
+          <w:i w:val="false"/>
+          <w:iCs w:val="false"/>
+          <w:caps w:val="false"/>
+          <w:smallCaps w:val="false"/>
+          <w:strike w:val="false"/>
+          <w:dstrike w:val="false"/>
+          <w:color w:val="000000"/>
+          <w:position w:val="0"/>
+          <w:sz w:val="22"/>
+          <w:szCs w:val="22"/>
+          <w:u w:val="none"/>
+          <w:shd w:fill="auto" w:val="clear"/>
+          <w:vertAlign w:val="baseline"/>
+        </w:rPr>
+        <w:t>O</w:t>
+      </w:r>
+      <w:r>
+        <w:rPr>
+          <w:rFonts w:eastAsia="Open Sans" w:cs="Open Sans" w:ascii="Open Sans" w:hAnsi="Open Sans"/>
+          <w:b w:val="false"/>
+          <w:bCs w:val="false"/>
+          <w:i w:val="false"/>
+          <w:iCs w:val="false"/>
+          <w:caps w:val="false"/>
+          <w:smallCaps w:val="false"/>
+          <w:strike w:val="false"/>
+          <w:dstrike w:val="false"/>
+          <w:color w:val="000000"/>
+          <w:position w:val="0"/>
+          <w:sz w:val="22"/>
+          <w:szCs w:val="22"/>
+          <w:u w:val="none"/>
+          <w:shd w:fill="auto" w:val="clear"/>
+          <w:vertAlign w:val="baseline"/>
+        </w:rPr>
+        <w:t>N</w:t>
+      </w:r>
+      <w:r>
+        <w:rPr>
+          <w:rFonts w:eastAsia="Open Sans" w:cs="Open Sans" w:ascii="Open Sans" w:hAnsi="Open Sans"/>
+          <w:b w:val="false"/>
+          <w:bCs w:val="false"/>
+          <w:i w:val="false"/>
+          <w:iCs w:val="false"/>
+          <w:caps w:val="false"/>
+          <w:smallCaps w:val="false"/>
+          <w:strike w:val="false"/>
+          <w:dstrike w:val="false"/>
+          <w:color w:val="000000"/>
+          <w:position w:val="0"/>
+          <w:sz w:val="22"/>
+          <w:szCs w:val="22"/>
+          <w:u w:val="none"/>
+          <w:shd w:fill="auto" w:val="clear"/>
+          <w:vertAlign w:val="baseline"/>
+        </w:rPr>
+        <w:t>A</w:t>
+      </w:r>
+      <w:r>
+        <w:rPr>
+          <w:rFonts w:eastAsia="Open Sans" w:cs="Open Sans" w:ascii="Open Sans" w:hAnsi="Open Sans"/>
+          <w:b w:val="false"/>
+          <w:bCs w:val="false"/>
+          <w:i w:val="false"/>
+          <w:iCs w:val="false"/>
+          <w:caps w:val="false"/>
+          <w:smallCaps w:val="false"/>
+          <w:strike w:val="false"/>
+          <w:dstrike w:val="false"/>
+          <w:color w:val="000000"/>
+          <w:position w:val="0"/>
+          <w:sz w:val="22"/>
+          <w:szCs w:val="22"/>
+          <w:u w:val="none"/>
+          <w:shd w:fill="auto" w:val="clear"/>
+          <w:vertAlign w:val="baseline"/>
+        </w:rPr>
+        <w:t>R</w:t>
+      </w:r>
+      <w:r>
+        <w:rPr>
+          <w:rFonts w:eastAsia="Open Sans" w:cs="Open Sans" w:ascii="Open Sans" w:hAnsi="Open Sans"/>
+          <w:b w:val="false"/>
+          <w:bCs w:val="false"/>
+          <w:i w:val="false"/>
+          <w:iCs w:val="false"/>
+          <w:caps w:val="false"/>
+          <w:smallCaps w:val="false"/>
+          <w:strike w:val="false"/>
+          <w:dstrike w:val="false"/>
+          <w:color w:val="000000"/>
+          <w:position w:val="0"/>
+          <w:sz w:val="22"/>
+          <w:szCs w:val="22"/>
+          <w:u w:val="none"/>
+          <w:shd w:fill="auto" w:val="clear"/>
+          <w:vertAlign w:val="baseline"/>
+        </w:rPr>
+        <w:t>I</w:t>
+      </w:r>
+      <w:r>
+        <w:rPr>
+          <w:rFonts w:eastAsia="Open Sans" w:cs="Open Sans" w:ascii="Open Sans" w:hAnsi="Open Sans"/>
+          <w:b w:val="false"/>
+          <w:bCs w:val="false"/>
+          <w:i w:val="false"/>
+          <w:iCs w:val="false"/>
+          <w:caps w:val="false"/>
+          <w:smallCaps w:val="false"/>
+          <w:strike w:val="false"/>
+          <w:dstrike w:val="false"/>
+          <w:color w:val="000000"/>
+          <w:position w:val="0"/>
+          <w:sz w:val="22"/>
+          <w:szCs w:val="22"/>
+          <w:u w:val="none"/>
+          <w:shd w:fill="auto" w:val="clear"/>
+          <w:vertAlign w:val="baseline"/>
+        </w:rPr>
+        <w:t>O</w:t>
+      </w:r>
+      <w:r>
+        <w:rPr>
+          <w:rFonts w:eastAsia="Open Sans" w:cs="Open Sans" w:ascii="Open Sans" w:hAnsi="Open Sans"/>
+          <w:b w:val="false"/>
+          <w:bCs w:val="false"/>
+          <w:i w:val="false"/>
+          <w:iCs w:val="false"/>
+          <w:caps w:val="false"/>
+          <w:smallCaps w:val="false"/>
+          <w:strike w:val="false"/>
+          <w:dstrike w:val="false"/>
+          <w:color w:val="000000"/>
+          <w:position w:val="0"/>
+          <w:sz w:val="22"/>
+          <w:szCs w:val="22"/>
+          <w:u w:val="none"/>
+          <w:shd w:fill="auto" w:val="clear"/>
+          <w:vertAlign w:val="baseline"/>
+        </w:rPr>
+        <w:t>_</w:t>
+      </w:r>
+      <w:r>
+        <w:rPr>
+          <w:rFonts w:eastAsia="Open Sans" w:cs="Open Sans" w:ascii="Open Sans" w:hAnsi="Open Sans"/>
+          <w:b w:val="false"/>
+          <w:bCs w:val="false"/>
+          <w:i w:val="false"/>
+          <w:iCs w:val="false"/>
+          <w:caps w:val="false"/>
+          <w:smallCaps w:val="false"/>
+          <w:strike w:val="false"/>
+          <w:dstrike w:val="false"/>
+          <w:color w:val="000000"/>
+          <w:position w:val="0"/>
+          <w:sz w:val="22"/>
+          <w:szCs w:val="22"/>
+          <w:u w:val="none"/>
+          <w:shd w:fill="auto" w:val="clear"/>
+          <w:vertAlign w:val="baseline"/>
+        </w:rPr>
+        <w:t>E</w:t>
+      </w:r>
+      <w:r>
+        <w:rPr>
+          <w:rFonts w:eastAsia="Open Sans" w:cs="Open Sans" w:ascii="Open Sans" w:hAnsi="Open Sans"/>
+          <w:b w:val="false"/>
+          <w:bCs w:val="false"/>
+          <w:i w:val="false"/>
+          <w:iCs w:val="false"/>
+          <w:caps w:val="false"/>
+          <w:smallCaps w:val="false"/>
+          <w:strike w:val="false"/>
+          <w:dstrike w:val="false"/>
+          <w:color w:val="000000"/>
+          <w:position w:val="0"/>
+          <w:sz w:val="22"/>
+          <w:szCs w:val="22"/>
+          <w:u w:val="none"/>
+          <w:shd w:fill="auto" w:val="clear"/>
+          <w:vertAlign w:val="baseline"/>
+        </w:rPr>
+        <w:t>M</w:t>
+      </w:r>
+      <w:r>
+        <w:rPr>
+          <w:rFonts w:eastAsia="Open Sans" w:cs="Open Sans" w:ascii="Open Sans" w:hAnsi="Open Sans"/>
+          <w:b w:val="false"/>
+          <w:bCs w:val="false"/>
+          <w:i w:val="false"/>
+          <w:iCs w:val="false"/>
+          <w:caps w:val="false"/>
+          <w:smallCaps w:val="false"/>
+          <w:strike w:val="false"/>
+          <w:dstrike w:val="false"/>
+          <w:color w:val="000000"/>
+          <w:position w:val="0"/>
+          <w:sz w:val="22"/>
+          <w:szCs w:val="22"/>
+          <w:u w:val="none"/>
+          <w:shd w:fill="auto" w:val="clear"/>
+          <w:vertAlign w:val="baseline"/>
+        </w:rPr>
+        <w:t>P</w:t>
+      </w:r>
+      <w:r>
+        <w:rPr>
+          <w:rFonts w:eastAsia="Open Sans" w:cs="Open Sans" w:ascii="Open Sans" w:hAnsi="Open Sans"/>
+          <w:b w:val="false"/>
+          <w:bCs w:val="false"/>
+          <w:i w:val="false"/>
+          <w:iCs w:val="false"/>
+          <w:caps w:val="false"/>
+          <w:smallCaps w:val="false"/>
+          <w:strike w:val="false"/>
+          <w:dstrike w:val="false"/>
+          <w:color w:val="000000"/>
+          <w:position w:val="0"/>
+          <w:sz w:val="22"/>
+          <w:szCs w:val="22"/>
+          <w:u w:val="none"/>
+          <w:shd w:fill="auto" w:val="clear"/>
+          <w:vertAlign w:val="baseline"/>
+        </w:rPr>
+        <w:t>R</w:t>
+      </w:r>
+      <w:r>
+        <w:rPr>
+          <w:rFonts w:eastAsia="Open Sans" w:cs="Open Sans" w:ascii="Open Sans" w:hAnsi="Open Sans"/>
+          <w:b w:val="false"/>
+          <w:bCs w:val="false"/>
+          <w:i w:val="false"/>
+          <w:iCs w:val="false"/>
+          <w:caps w:val="false"/>
+          <w:smallCaps w:val="false"/>
+          <w:strike w:val="false"/>
+          <w:dstrike w:val="false"/>
+          <w:color w:val="000000"/>
+          <w:position w:val="0"/>
+          <w:sz w:val="22"/>
+          <w:szCs w:val="22"/>
+          <w:u w:val="none"/>
+          <w:shd w:fill="auto" w:val="clear"/>
+          <w:vertAlign w:val="baseline"/>
+        </w:rPr>
+        <w:t>E</w:t>
+      </w:r>
+      <w:r>
+        <w:rPr>
+          <w:rFonts w:eastAsia="Open Sans" w:cs="Open Sans" w:ascii="Open Sans" w:hAnsi="Open Sans"/>
+          <w:b w:val="false"/>
+          <w:bCs w:val="false"/>
+          <w:i w:val="false"/>
+          <w:iCs w:val="false"/>
+          <w:caps w:val="false"/>
+          <w:smallCaps w:val="false"/>
+          <w:strike w:val="false"/>
+          <w:dstrike w:val="false"/>
+          <w:color w:val="000000"/>
+          <w:position w:val="0"/>
+          <w:sz w:val="22"/>
+          <w:szCs w:val="22"/>
+          <w:u w:val="none"/>
+          <w:shd w:fill="auto" w:val="clear"/>
+          <w:vertAlign w:val="baseline"/>
+        </w:rPr>
+        <w:t>S</w:t>
+      </w:r>
+      <w:r>
+        <w:rPr>
+          <w:rFonts w:eastAsia="Open Sans" w:cs="Open Sans" w:ascii="Open Sans" w:hAnsi="Open Sans"/>
+          <w:b w:val="false"/>
+          <w:bCs w:val="false"/>
+          <w:i w:val="false"/>
+          <w:iCs w:val="false"/>
+          <w:caps w:val="false"/>
+          <w:smallCaps w:val="false"/>
+          <w:strike w:val="false"/>
+          <w:dstrike w:val="false"/>
+          <w:color w:val="000000"/>
+          <w:position w:val="0"/>
+          <w:sz w:val="22"/>
+          <w:szCs w:val="22"/>
+          <w:u w:val="none"/>
+          <w:shd w:fill="auto" w:val="clear"/>
+          <w:vertAlign w:val="baseline"/>
+        </w:rPr>
+        <w:t>A</w:t>
+      </w:r>
+      <w:r>
+        <w:rPr>
+          <w:rFonts w:eastAsia="Open Sans" w:cs="Open Sans" w:ascii="Open Sans" w:hAnsi="Open Sans"/>
+          <w:b w:val="false"/>
+          <w:bCs w:val="false"/>
+          <w:i w:val="false"/>
+          <w:iCs w:val="false"/>
+          <w:caps w:val="false"/>
+          <w:smallCaps w:val="false"/>
+          <w:strike w:val="false"/>
+          <w:dstrike w:val="false"/>
+          <w:color w:val="000000"/>
+          <w:position w:val="0"/>
+          <w:sz w:val="22"/>
+          <w:szCs w:val="22"/>
+          <w:u w:val="none"/>
+          <w:shd w:fill="auto" w:val="clear"/>
+          <w:vertAlign w:val="baseline"/>
+        </w:rPr>
+        <w:t>]</w:t>
+      </w:r>
+      <w:r>
+        <w:rPr>
+          <w:rFonts w:eastAsia="Open Sans" w:cs="Open Sans" w:ascii="Open Sans" w:hAnsi="Open Sans"/>
+          <w:b w:val="false"/>
+          <w:bCs w:val="false"/>
+          <w:i w:val="false"/>
+          <w:iCs w:val="false"/>
+          <w:caps w:val="false"/>
+          <w:smallCaps w:val="false"/>
+          <w:strike w:val="false"/>
+          <w:dstrike w:val="false"/>
+          <w:color w:val="000000"/>
+          <w:position w:val="0"/>
+          <w:sz w:val="22"/>
+          <w:szCs w:val="22"/>
+          <w:u w:val="none"/>
+          <w:shd w:fill="auto" w:val="clear"/>
+          <w:vertAlign w:val="baseline"/>
+        </w:rPr>
+        <w:t>]</w:t>
+      </w:r>
+    </w:p>
+    <w:p>
+      <w:pPr>
+        <w:pStyle w:val="normal1"/>
+        <w:widowControl w:val="false"/>
         <w:shd w:val="clear" w:fill="auto"/>
         <w:spacing w:lineRule="auto" w:line="240" w:before="200" w:after="0"/>
         <w:ind w:hanging="0" w:start="43" w:end="0"/>
@@ -537,27 +1006,47 @@
       </w:pPr>
       <w:r>
         <w:rPr>
-          <w:b/>
-          <w:bCs/>
-          <w:sz w:val="24"/>
-          <w:szCs w:val="24"/>
-        </w:rPr>
-        <w:t>Data de admissão:</w:t>
-      </w:r>
-      <w:r>
-        <w:rPr/>
-        <w:t xml:space="preserve"> </w:t>
-      </w:r>
-      <w:r>
-        <w:rPr/>
-        <w:t>[[DATA_ADMISSAO]]</w:t>
-      </w:r>
-    </w:p>
-    <w:p>
-      <w:pPr>
-        <w:pStyle w:val="normal1"/>
-        <w:widowControl w:val="false"/>
-        <w:pBdr/>
+          <w:rFonts w:eastAsia="Open Sans" w:cs="Open Sans" w:ascii="Open Sans" w:hAnsi="Open Sans"/>
+          <w:b/>
+          <w:bCs/>
+          <w:i w:val="false"/>
+          <w:iCs w:val="false"/>
+          <w:caps w:val="false"/>
+          <w:smallCaps w:val="false"/>
+          <w:strike w:val="false"/>
+          <w:dstrike w:val="false"/>
+          <w:color w:val="000000"/>
+          <w:sz w:val="24"/>
+          <w:szCs w:val="24"/>
+          <w:u w:val="none"/>
+          <w:shd w:fill="auto" w:val="clear"/>
+        </w:rPr>
+        <w:t xml:space="preserve">Cargo: </w:t>
+      </w:r>
+      <w:r>
+        <w:rPr>
+          <w:rFonts w:eastAsia="Open Sans" w:cs="Open Sans" w:ascii="Open Sans" w:hAnsi="Open Sans"/>
+          <w:b w:val="false"/>
+          <w:bCs w:val="false"/>
+          <w:i w:val="false"/>
+          <w:iCs w:val="false"/>
+          <w:caps w:val="false"/>
+          <w:smallCaps w:val="false"/>
+          <w:strike w:val="false"/>
+          <w:dstrike w:val="false"/>
+          <w:color w:val="000000"/>
+          <w:sz w:val="22"/>
+          <w:szCs w:val="22"/>
+          <w:u w:val="none"/>
+          <w:shd w:fill="auto" w:val="clear"/>
+        </w:rPr>
+        <w:t>[[CARGO]]</w:t>
+      </w:r>
+    </w:p>
+    <w:p>
+      <w:pPr>
+        <w:pStyle w:val="normal1"/>
+        <w:widowControl w:val="false"/>
         <w:shd w:val="clear" w:fill="auto"/>
         <w:spacing w:lineRule="auto" w:line="240" w:before="200" w:after="0"/>
         <w:ind w:hanging="0" w:start="43" w:end="0"/>
@@ -583,28 +1072,22 @@
       </w:pPr>
       <w:r>
         <w:rPr>
-          <w:rFonts w:eastAsia="Open Sans" w:cs="Open Sans" w:ascii="Open Sans" w:hAnsi="Open Sans"/>
-          <w:b/>
-          <w:bCs/>
-          <w:i w:val="false"/>
-          <w:iCs w:val="false"/>
-          <w:caps w:val="false"/>
-          <w:smallCaps w:val="false"/>
-          <w:strike w:val="false"/>
-          <w:dstrike w:val="false"/>
-          <w:color w:val="000000"/>
-          <w:sz w:val="24"/>
-          <w:szCs w:val="24"/>
-          <w:u w:val="none"/>
-          <w:shd w:fill="auto" w:val="clear"/>
-        </w:rPr>
-      </w:r>
-    </w:p>
-    <w:p>
-      <w:pPr>
-        <w:pStyle w:val="normal1"/>
-        <w:widowControl w:val="false"/>
-        <w:pBdr/>
+          <w:b/>
+          <w:bCs/>
+          <w:sz w:val="24"/>
+          <w:szCs w:val="24"/>
+        </w:rPr>
+        <w:t>Data de admissão:</w:t>
+      </w:r>
+      <w:r>
+        <w:rPr/>
+        <w:t xml:space="preserve"> [[DATA_ADMISSAO]]</w:t>
+      </w:r>
+    </w:p>
+    <w:p>
+      <w:pPr>
+        <w:pStyle w:val="normal1"/>
+        <w:widowControl w:val="false"/>
         <w:shd w:val="clear" w:fill="auto"/>
         <w:spacing w:lineRule="auto" w:line="240" w:before="200" w:after="0"/>
         <w:ind w:hanging="0" w:start="43" w:end="0"/>
@@ -640,18 +1123,19 @@
           <w:strike w:val="false"/>
           <w:dstrike w:val="false"/>
           <w:color w:val="000000"/>
-          <w:sz w:val="24"/>
-          <w:szCs w:val="24"/>
-          <w:u w:val="none"/>
-          <w:shd w:fill="auto" w:val="clear"/>
-        </w:rPr>
-      </w:r>
-    </w:p>
-    <w:p>
-      <w:pPr>
-        <w:pStyle w:val="normal1"/>
-        <w:widowControl w:val="false"/>
-        <w:pBdr/>
+          <w:position w:val="0"/>
+          <w:sz w:val="24"/>
+          <w:szCs w:val="24"/>
+          <w:u w:val="none"/>
+          <w:shd w:fill="auto" w:val="clear"/>
+          <w:vertAlign w:val="baseline"/>
+        </w:rPr>
+      </w:r>
+    </w:p>
+    <w:p>
+      <w:pPr>
+        <w:pStyle w:val="normal1"/>
+        <w:widowControl w:val="false"/>
         <w:shd w:val="clear" w:fill="auto"/>
         <w:spacing w:lineRule="auto" w:line="240" w:before="200" w:after="0"/>
         <w:ind w:hanging="0" w:start="43" w:end="0"/>
@@ -687,18 +1171,19 @@
           <w:strike w:val="false"/>
           <w:dstrike w:val="false"/>
           <w:color w:val="000000"/>
-          <w:sz w:val="24"/>
-          <w:szCs w:val="24"/>
-          <w:u w:val="none"/>
-          <w:shd w:fill="auto" w:val="clear"/>
-        </w:rPr>
-      </w:r>
-    </w:p>
-    <w:p>
-      <w:pPr>
-        <w:pStyle w:val="normal1"/>
-        <w:widowControl w:val="false"/>
-        <w:pBdr/>
+          <w:position w:val="0"/>
+          <w:sz w:val="24"/>
+          <w:szCs w:val="24"/>
+          <w:u w:val="none"/>
+          <w:shd w:fill="auto" w:val="clear"/>
+          <w:vertAlign w:val="baseline"/>
+        </w:rPr>
+      </w:r>
+    </w:p>
+    <w:p>
+      <w:pPr>
+        <w:pStyle w:val="normal1"/>
+        <w:widowControl w:val="false"/>
         <w:shd w:val="clear" w:fill="auto"/>
         <w:spacing w:lineRule="auto" w:line="240" w:before="200" w:after="0"/>
         <w:ind w:hanging="0" w:start="43" w:end="0"/>
@@ -734,18 +1219,19 @@
           <w:strike w:val="false"/>
           <w:dstrike w:val="false"/>
           <w:color w:val="000000"/>
-          <w:sz w:val="24"/>
-          <w:szCs w:val="24"/>
-          <w:u w:val="none"/>
-          <w:shd w:fill="auto" w:val="clear"/>
-        </w:rPr>
-      </w:r>
-    </w:p>
-    <w:p>
-      <w:pPr>
-        <w:pStyle w:val="normal1"/>
-        <w:widowControl w:val="false"/>
-        <w:pBdr/>
+          <w:position w:val="0"/>
+          <w:sz w:val="24"/>
+          <w:szCs w:val="24"/>
+          <w:u w:val="none"/>
+          <w:shd w:fill="auto" w:val="clear"/>
+          <w:vertAlign w:val="baseline"/>
+        </w:rPr>
+      </w:r>
+    </w:p>
+    <w:p>
+      <w:pPr>
+        <w:pStyle w:val="normal1"/>
+        <w:widowControl w:val="false"/>
         <w:shd w:val="clear" w:fill="auto"/>
         <w:spacing w:lineRule="auto" w:line="240" w:before="200" w:after="0"/>
         <w:ind w:hanging="0" w:start="43" w:end="0"/>
@@ -781,18 +1267,19 @@
           <w:strike w:val="false"/>
           <w:dstrike w:val="false"/>
           <w:color w:val="000000"/>
-          <w:sz w:val="24"/>
-          <w:szCs w:val="24"/>
-          <w:u w:val="none"/>
-          <w:shd w:fill="auto" w:val="clear"/>
-        </w:rPr>
-      </w:r>
-    </w:p>
-    <w:p>
-      <w:pPr>
-        <w:pStyle w:val="normal1"/>
-        <w:widowControl w:val="false"/>
-        <w:pBdr/>
+          <w:position w:val="0"/>
+          <w:sz w:val="24"/>
+          <w:szCs w:val="24"/>
+          <w:u w:val="none"/>
+          <w:shd w:fill="auto" w:val="clear"/>
+          <w:vertAlign w:val="baseline"/>
+        </w:rPr>
+      </w:r>
+    </w:p>
+    <w:p>
+      <w:pPr>
+        <w:pStyle w:val="normal1"/>
+        <w:widowControl w:val="false"/>
         <w:shd w:val="clear" w:fill="auto"/>
         <w:spacing w:lineRule="auto" w:line="240" w:before="200" w:after="0"/>
         <w:ind w:hanging="0" w:start="43" w:end="0"/>
@@ -828,18 +1315,19 @@
           <w:strike w:val="false"/>
           <w:dstrike w:val="false"/>
           <w:color w:val="000000"/>
-          <w:sz w:val="24"/>
-          <w:szCs w:val="24"/>
-          <w:u w:val="none"/>
-          <w:shd w:fill="auto" w:val="clear"/>
-        </w:rPr>
-      </w:r>
-    </w:p>
-    <w:p>
-      <w:pPr>
-        <w:pStyle w:val="normal1"/>
-        <w:widowControl w:val="false"/>
-        <w:pBdr/>
+          <w:position w:val="0"/>
+          <w:sz w:val="24"/>
+          <w:szCs w:val="24"/>
+          <w:u w:val="none"/>
+          <w:shd w:fill="auto" w:val="clear"/>
+          <w:vertAlign w:val="baseline"/>
+        </w:rPr>
+      </w:r>
+    </w:p>
+    <w:p>
+      <w:pPr>
+        <w:pStyle w:val="normal1"/>
+        <w:widowControl w:val="false"/>
         <w:shd w:val="clear" w:fill="auto"/>
         <w:spacing w:lineRule="auto" w:line="240" w:before="200" w:after="0"/>
         <w:ind w:hanging="0" w:start="43" w:end="0"/>
@@ -875,18 +1363,67 @@
           <w:strike w:val="false"/>
           <w:dstrike w:val="false"/>
           <w:color w:val="000000"/>
-          <w:sz w:val="24"/>
-          <w:szCs w:val="24"/>
-          <w:u w:val="none"/>
-          <w:shd w:fill="auto" w:val="clear"/>
-        </w:rPr>
-      </w:r>
-    </w:p>
-    <w:p>
-      <w:pPr>
-        <w:pStyle w:val="normal1"/>
-        <w:widowControl w:val="false"/>
-        <w:pBdr/>
+          <w:position w:val="0"/>
+          <w:sz w:val="24"/>
+          <w:szCs w:val="24"/>
+          <w:u w:val="none"/>
+          <w:shd w:fill="auto" w:val="clear"/>
+          <w:vertAlign w:val="baseline"/>
+        </w:rPr>
+      </w:r>
+    </w:p>
+    <w:p>
+      <w:pPr>
+        <w:pStyle w:val="normal1"/>
+        <w:widowControl w:val="false"/>
+        <w:shd w:val="clear" w:fill="auto"/>
+        <w:spacing w:lineRule="auto" w:line="240" w:before="200" w:after="0"/>
+        <w:ind w:hanging="0" w:start="43" w:end="0"/>
+        <w:jc w:val="start"/>
+        <w:rPr>
+          <w:rFonts w:ascii="Open Sans" w:hAnsi="Open Sans" w:eastAsia="Open Sans" w:cs="Open Sans"/>
+          <w:b/>
+          <w:bCs/>
+          <w:i w:val="false"/>
+          <w:iCs w:val="false"/>
+          <w:caps w:val="false"/>
+          <w:smallCaps w:val="false"/>
+          <w:strike w:val="false"/>
+          <w:dstrike w:val="false"/>
+          <w:color w:val="000000"/>
+          <w:position w:val="0"/>
+          <w:sz w:val="24"/>
+          <w:szCs w:val="24"/>
+          <w:u w:val="none"/>
+          <w:shd w:fill="auto" w:val="clear"/>
+          <w:vertAlign w:val="baseline"/>
+        </w:rPr>
+      </w:pPr>
+      <w:r>
+        <w:rPr>
+          <w:rFonts w:eastAsia="Open Sans" w:cs="Open Sans" w:ascii="Open Sans" w:hAnsi="Open Sans"/>
+          <w:b/>
+          <w:bCs/>
+          <w:i w:val="false"/>
+          <w:iCs w:val="false"/>
+          <w:caps w:val="false"/>
+          <w:smallCaps w:val="false"/>
+          <w:strike w:val="false"/>
+          <w:dstrike w:val="false"/>
+          <w:color w:val="000000"/>
+          <w:position w:val="0"/>
+          <w:sz w:val="24"/>
+          <w:szCs w:val="24"/>
+          <w:u w:val="none"/>
+          <w:shd w:fill="auto" w:val="clear"/>
+          <w:vertAlign w:val="baseline"/>
+        </w:rPr>
+      </w:r>
+    </w:p>
+    <w:p>
+      <w:pPr>
+        <w:pStyle w:val="normal1"/>
+        <w:widowControl w:val="false"/>
         <w:shd w:val="clear" w:fill="auto"/>
         <w:spacing w:lineRule="auto" w:line="240" w:before="200" w:after="0"/>
         <w:ind w:hanging="0" w:start="43" w:end="0"/>
@@ -957,7 +1494,6 @@
       <w:pPr>
         <w:pStyle w:val="normal1"/>
         <w:widowControl w:val="false"/>
-        <w:pBdr/>
         <w:shd w:val="clear" w:fill="auto"/>
         <w:spacing w:lineRule="auto" w:line="240" w:before="200" w:after="0"/>
         <w:ind w:hanging="0" w:start="0" w:end="0"/>
@@ -1005,7 +1541,6 @@
       <w:pPr>
         <w:pStyle w:val="normal1"/>
         <w:widowControl w:val="false"/>
-        <w:pBdr/>
         <w:shd w:val="clear" w:fill="auto"/>
         <w:spacing w:lineRule="auto" w:line="240" w:before="200" w:after="0"/>
         <w:ind w:hanging="0" w:start="0" w:end="0"/>
@@ -1050,7 +1585,6 @@
       <w:pPr>
         <w:pStyle w:val="normal1"/>
         <w:widowControl w:val="false"/>
-        <w:pBdr/>
         <w:shd w:val="clear" w:fill="auto"/>
         <w:spacing w:lineRule="auto" w:line="240" w:before="200" w:after="0"/>
         <w:ind w:hanging="0" w:start="0" w:end="0"/>
@@ -1098,7 +1632,6 @@
       <w:pPr>
         <w:pStyle w:val="normal1"/>
         <w:widowControl w:val="false"/>
-        <w:pBdr/>
         <w:shd w:val="clear" w:fill="auto"/>
         <w:spacing w:lineRule="auto" w:line="240" w:before="200" w:after="0"/>
         <w:ind w:hanging="0" w:start="0" w:end="0"/>
@@ -1177,6 +1710,7 @@
     <w:qFormat/>
     <w:pPr>
       <w:widowControl/>
+      <w:suppressAutoHyphens w:val="true"/>
       <w:bidi w:val="0"/>
       <w:spacing w:lineRule="auto" w:line="276" w:before="0" w:after="0"/>
       <w:jc w:val="start"/>
@@ -1356,11 +1890,38 @@
       <w:rFonts w:cs="Noto Sans Devanagari"/>
     </w:rPr>
   </w:style>
+  <w:style w:type="paragraph" w:styleId="Ttulouser">
+    <w:name w:val="Título (user)"/>
+    <w:basedOn w:val="Normal"/>
+    <w:next w:val="BodyText"/>
+    <w:qFormat/>
+    <w:pPr>
+      <w:keepNext w:val="true"/>
+      <w:spacing w:before="240" w:after="120"/>
+    </w:pPr>
+    <w:rPr>
+      <w:rFonts w:ascii="Liberation Sans" w:hAnsi="Liberation Sans" w:eastAsia="Noto Sans CJK SC" w:cs="Noto Sans Devanagari"/>
+      <w:sz w:val="28"/>
+      <w:szCs w:val="28"/>
+    </w:rPr>
+  </w:style>
+  <w:style w:type="paragraph" w:styleId="ndiceuser">
+    <w:name w:val="Índice (user)"/>
+    <w:basedOn w:val="Normal"/>
+    <w:qFormat/>
+    <w:pPr>
+      <w:suppressLineNumbers/>
+    </w:pPr>
+    <w:rPr>
+      <w:rFonts w:cs="Noto Sans Devanagari"/>
+    </w:rPr>
+  </w:style>
   <w:style w:type="paragraph" w:styleId="normal1" w:default="1">
     <w:name w:val="normal1"/>
     <w:qFormat/>
     <w:pPr>
       <w:widowControl/>
+      <w:suppressAutoHyphens w:val="true"/>
       <w:bidi w:val="0"/>
       <w:spacing w:lineRule="auto" w:line="276" w:before="0" w:after="0"/>
       <w:jc w:val="start"/>

</xml_diff>